<commit_message>
Add GitHub Projects Kanban visibility spike to Objective 2
Agent-Logs-Url: https://github.com/norrisaftcc/milestone-26sp-review/sessions/3924dabd-5fdf-4449-9ab5-e81cabbc6151

Co-authored-by: norrisaftcc <15367101+norrisaftcc@users.noreply.github.com>
</commit_message>
<xml_diff>
--- a/outputs/04_Objective_2_Source_Control_Version_Control_Instructional_Modules.docx
+++ b/outputs/04_Objective_2_Source_Control_Version_Control_Instructional_Modules.docx
@@ -2,7 +2,7 @@
 <file path=word/document.xml><?xml version="1.0" encoding="utf-8"?>
 <w:document xmlns:w="http://schemas.openxmlformats.org/wordprocessingml/2006/main" xmlns:m="http://schemas.openxmlformats.org/officeDocument/2006/math" xmlns:r="http://schemas.openxmlformats.org/officeDocument/2006/relationships" xmlns:o="urn:schemas-microsoft-com:office:office" xmlns:v="urn:schemas-microsoft-com:vml" xmlns:w10="urn:schemas-microsoft-com:office:word" xmlns:a="http://schemas.openxmlformats.org/drawingml/2006/main" xmlns:pic="http://schemas.openxmlformats.org/drawingml/2006/picture" xmlns:wp="http://schemas.openxmlformats.org/drawingml/2006/wordprocessingDrawing">
   <w:body>
-    <w:bookmarkStart w:id="42" w:name="Xb6033da6e6e6ab42af6aa23972fd6adf8c7bac7"/>
+    <w:bookmarkStart w:id="43" w:name="Xb6033da6e6e6ab42af6aa23972fd6adf8c7bac7"/>
     <w:p>
       <w:pPr>
         <w:pStyle w:val="Heading1"/>
@@ -692,7 +692,7 @@
     </w:p>
     <w:bookmarkEnd w:id="25"/>
     <w:bookmarkEnd w:id="26"/>
-    <w:bookmarkStart w:id="31" w:name="module-descriptions"/>
+    <w:bookmarkStart w:id="32" w:name="module-descriptions"/>
     <w:p>
       <w:pPr>
         <w:pStyle w:val="Heading2"/>
@@ -701,7 +701,7 @@
         <w:t xml:space="preserve">Module Descriptions</w:t>
       </w:r>
     </w:p>
-    <w:bookmarkStart w:id="27" w:name="Xb0b962f346a299d1b0bf3f0627992ebb80198f4"/>
+    <w:bookmarkStart w:id="28" w:name="Xb0b962f346a299d1b0bf3f0627992ebb80198f4"/>
     <w:p>
       <w:pPr>
         <w:pStyle w:val="Heading3"/>
@@ -744,25 +744,117 @@
         <w:t xml:space="preserve">The issue template used in this course — user story, acceptance criteria, technical notes, and explicit definition of done — mirrors industry-standard formats used by professional teams on GitHub, Jira, and Linear. Students who arrive at an employer already fluent in this format reduce their onboarding time and signal professional maturity from day one.</w:t>
       </w:r>
     </w:p>
-    <w:bookmarkEnd w:id="27"/>
-    <w:bookmarkStart w:id="28" w:name="module-2-branch-and-merge-workflow"/>
-    <w:p>
-      <w:pPr>
-        <w:pStyle w:val="Heading3"/>
-      </w:pPr>
-      <w:r>
-        <w:t xml:space="preserve">Module 2 — Branch-and-Merge Workflow</w:t>
+    <w:bookmarkStart w:id="27" w:name="X1653c0394c1e886a8f3d8b34a2cb31581de6099"/>
+    <w:p>
+      <w:pPr>
+        <w:pStyle w:val="Heading4"/>
+      </w:pPr>
+      <w:r>
+        <w:t xml:space="preserve">Stakeholder Visibility Spike: GitHub Projects Kanban</w:t>
       </w:r>
     </w:p>
     <w:p>
       <w:pPr>
         <w:pStyle w:val="FirstParagraph"/>
+      </w:pPr>
+      <w:r>
+        <w:t xml:space="preserve">To increase report-chain visibility during delivery, the module now includes a presentation-ready GitHub Projects Kanban view driven by the same issue artifacts students already maintain. The board uses three status columns aligned to stakeholder language:</w:t>
+      </w:r>
+    </w:p>
+    <w:p>
+      <w:pPr>
+        <w:numPr>
+          <w:ilvl w:val="0"/>
+          <w:numId w:val="1003"/>
+        </w:numPr>
+        <w:pStyle w:val="Compact"/>
       </w:pPr>
       <w:r>
         <w:rPr>
           <w:bCs/>
           <w:b/>
         </w:rPr>
+        <w:t xml:space="preserve">Blocked</w:t>
+      </w:r>
+      <w:r>
+        <w:t xml:space="preserve"> </w:t>
+      </w:r>
+      <w:r>
+        <w:t xml:space="preserve">— issue has dependency/risk label and cannot proceed</w:t>
+      </w:r>
+    </w:p>
+    <w:p>
+      <w:pPr>
+        <w:numPr>
+          <w:ilvl w:val="0"/>
+          <w:numId w:val="1003"/>
+        </w:numPr>
+        <w:pStyle w:val="Compact"/>
+      </w:pPr>
+      <w:r>
+        <w:rPr>
+          <w:bCs/>
+          <w:b/>
+        </w:rPr>
+        <w:t xml:space="preserve">In Progress</w:t>
+      </w:r>
+      <w:r>
+        <w:t xml:space="preserve"> </w:t>
+      </w:r>
+      <w:r>
+        <w:t xml:space="preserve">— active branch or draft PR exists</w:t>
+      </w:r>
+    </w:p>
+    <w:p>
+      <w:pPr>
+        <w:numPr>
+          <w:ilvl w:val="0"/>
+          <w:numId w:val="1003"/>
+        </w:numPr>
+        <w:pStyle w:val="Compact"/>
+      </w:pPr>
+      <w:r>
+        <w:rPr>
+          <w:bCs/>
+          <w:b/>
+        </w:rPr>
+        <w:t xml:space="preserve">Completed</w:t>
+      </w:r>
+      <w:r>
+        <w:t xml:space="preserve"> </w:t>
+      </w:r>
+      <w:r>
+        <w:t xml:space="preserve">— merged PR and closed issue</w:t>
+      </w:r>
+    </w:p>
+    <w:p>
+      <w:pPr>
+        <w:pStyle w:val="FirstParagraph"/>
+      </w:pPr>
+      <w:r>
+        <w:t xml:space="preserve">Because this view is powered by default GitHub issue/PR metadata (status, assignee, labels, linked PR state), no parallel tracking spreadsheet is required. Instructors can demonstrate current execution state and learning velocity (dy/dx) in one live screen during checkpoint reviews.</w:t>
+      </w:r>
+    </w:p>
+    <w:bookmarkEnd w:id="27"/>
+    <w:bookmarkEnd w:id="28"/>
+    <w:bookmarkStart w:id="29" w:name="module-2-branch-and-merge-workflow"/>
+    <w:p>
+      <w:pPr>
+        <w:pStyle w:val="Heading3"/>
+      </w:pPr>
+      <w:r>
+        <w:t xml:space="preserve">Module 2 — Branch-and-Merge Workflow</w:t>
+      </w:r>
+    </w:p>
+    <w:p>
+      <w:pPr>
+        <w:pStyle w:val="FirstParagraph"/>
+      </w:pPr>
+      <w:r>
+        <w:rPr>
+          <w:bCs/>
+          <w:b/>
+        </w:rPr>
         <w:t xml:space="preserve">Learning Objectives:</w:t>
       </w:r>
       <w:r>
@@ -813,8 +905,8 @@
         <w:t xml:space="preserve">rather than large, infrequent batch submissions. Students learn to work at the scale and rhythm professional review requires.</w:t>
       </w:r>
     </w:p>
-    <w:bookmarkEnd w:id="28"/>
-    <w:bookmarkStart w:id="29" w:name="module-3-pull-request-process"/>
+    <w:bookmarkEnd w:id="29"/>
+    <w:bookmarkStart w:id="30" w:name="module-3-pull-request-process"/>
     <w:p>
       <w:pPr>
         <w:pStyle w:val="Heading3"/>
@@ -870,8 +962,8 @@
         <w:t xml:space="preserve">: students learn to open a PR before their work is complete, flagging it as a discussion point rather than a submission. This practice, standard at companies like Google and Microsoft, interrupts the student habit of treating submission as a high-stakes, one-shot event. It normalizes iteration — a professional disposition that transfers far beyond version control.</w:t>
       </w:r>
     </w:p>
-    <w:bookmarkEnd w:id="29"/>
-    <w:bookmarkStart w:id="30" w:name="module-4-self-and-peer-code-review"/>
+    <w:bookmarkEnd w:id="30"/>
+    <w:bookmarkStart w:id="31" w:name="module-4-self-and-peer-code-review"/>
     <w:p>
       <w:pPr>
         <w:pStyle w:val="Heading3"/>
@@ -1039,9 +1131,9 @@
         </w:pict>
       </w:r>
     </w:p>
-    <w:bookmarkEnd w:id="30"/>
     <w:bookmarkEnd w:id="31"/>
-    <w:bookmarkStart w:id="32" w:name="X5d492f27f65a920b235ec8f8bd76600e12f8ca4"/>
+    <w:bookmarkEnd w:id="32"/>
+    <w:bookmarkStart w:id="33" w:name="X5d492f27f65a920b235ec8f8bd76600e12f8ca4"/>
     <w:p>
       <w:pPr>
         <w:pStyle w:val="Heading2"/>
@@ -1158,8 +1250,8 @@
         </w:pict>
       </w:r>
     </w:p>
-    <w:bookmarkEnd w:id="32"/>
-    <w:bookmarkStart w:id="35" w:name="evidence-of-effectiveness"/>
+    <w:bookmarkEnd w:id="33"/>
+    <w:bookmarkStart w:id="36" w:name="evidence-of-effectiveness"/>
     <w:p>
       <w:pPr>
         <w:pStyle w:val="Heading2"/>
@@ -1168,7 +1260,7 @@
         <w:t xml:space="preserve">Evidence of Effectiveness</w:t>
       </w:r>
     </w:p>
-    <w:bookmarkStart w:id="33" w:name="X14e2265485bf0abade394ee7d42f1016165dfea"/>
+    <w:bookmarkStart w:id="34" w:name="X14e2265485bf0abade394ee7d42f1016165dfea"/>
     <w:p>
       <w:pPr>
         <w:pStyle w:val="Heading3"/>
@@ -1468,8 +1560,8 @@
         <w:t xml:space="preserve">These figures reflect not just technical competency but professional behavioral formation — the actual outcome the objective was designed to produce.</w:t>
       </w:r>
     </w:p>
-    <w:bookmarkEnd w:id="33"/>
-    <w:bookmarkStart w:id="34" w:name="qualitative-outcomes"/>
+    <w:bookmarkEnd w:id="34"/>
+    <w:bookmarkStart w:id="35" w:name="qualitative-outcomes"/>
     <w:p>
       <w:pPr>
         <w:pStyle w:val="Heading3"/>
@@ -1579,9 +1671,9 @@
         </w:pict>
       </w:r>
     </w:p>
-    <w:bookmarkEnd w:id="34"/>
     <w:bookmarkEnd w:id="35"/>
-    <w:bookmarkStart w:id="38" w:name="scalability-and-institutional-value"/>
+    <w:bookmarkEnd w:id="36"/>
+    <w:bookmarkStart w:id="39" w:name="scalability-and-institutional-value"/>
     <w:p>
       <w:pPr>
         <w:pStyle w:val="Heading2"/>
@@ -1590,7 +1682,7 @@
         <w:t xml:space="preserve">Scalability and Institutional Value</w:t>
       </w:r>
     </w:p>
-    <w:bookmarkStart w:id="36" w:name="cross-course-implementation"/>
+    <w:bookmarkStart w:id="37" w:name="cross-course-implementation"/>
     <w:p>
       <w:pPr>
         <w:pStyle w:val="Heading3"/>
@@ -1605,98 +1697,6 @@
       </w:pPr>
       <w:r>
         <w:t xml:space="preserve">The modular design of the Sacred Workflow framework enables staged adoption across the curriculum:</w:t>
-      </w:r>
-    </w:p>
-    <w:p>
-      <w:pPr>
-        <w:numPr>
-          <w:ilvl w:val="0"/>
-          <w:numId w:val="1003"/>
-        </w:numPr>
-        <w:pStyle w:val="Compact"/>
-      </w:pPr>
-      <w:r>
-        <w:rPr>
-          <w:bCs/>
-          <w:b/>
-        </w:rPr>
-        <w:t xml:space="preserve">CSC 289</w:t>
-      </w:r>
-      <w:r>
-        <w:t xml:space="preserve"> </w:t>
-      </w:r>
-      <w:r>
-        <w:t xml:space="preserve">(Capstone): Full four-module implementation, current semester</w:t>
-      </w:r>
-    </w:p>
-    <w:p>
-      <w:pPr>
-        <w:numPr>
-          <w:ilvl w:val="0"/>
-          <w:numId w:val="1003"/>
-        </w:numPr>
-        <w:pStyle w:val="Compact"/>
-      </w:pPr>
-      <w:r>
-        <w:rPr>
-          <w:bCs/>
-          <w:b/>
-        </w:rPr>
-        <w:t xml:space="preserve">CTS 285</w:t>
-      </w:r>
-      <w:r>
-        <w:t xml:space="preserve"> </w:t>
-      </w:r>
-      <w:r>
-        <w:t xml:space="preserve">(Web Development): Issue tracking and basic branch workflow, current semester</w:t>
-      </w:r>
-    </w:p>
-    <w:p>
-      <w:pPr>
-        <w:numPr>
-          <w:ilvl w:val="0"/>
-          <w:numId w:val="1003"/>
-        </w:numPr>
-        <w:pStyle w:val="Compact"/>
-      </w:pPr>
-      <w:r>
-        <w:rPr>
-          <w:bCs/>
-          <w:b/>
-        </w:rPr>
-        <w:t xml:space="preserve">CSC 151</w:t>
-      </w:r>
-      <w:r>
-        <w:t xml:space="preserve"> </w:t>
-      </w:r>
-      <w:r>
-        <w:t xml:space="preserve">(Intro CS): Issue tracking module, planned implementation</w:t>
-      </w:r>
-    </w:p>
-    <w:p>
-      <w:pPr>
-        <w:pStyle w:val="FirstParagraph"/>
-      </w:pPr>
-      <w:r>
-        <w:t xml:space="preserve">Each time a student encounters this workflow in a subsequent course, the professional habit is reinforced rather than introduced. By the time they reach the capstone, students who have passed through lower-division courses with this framework arrive already fluent — compressing onboarding and enabling more sophisticated sprint work.</w:t>
-      </w:r>
-    </w:p>
-    <w:bookmarkEnd w:id="36"/>
-    <w:bookmarkStart w:id="37" w:name="reusable-artifacts-created"/>
-    <w:p>
-      <w:pPr>
-        <w:pStyle w:val="Heading3"/>
-      </w:pPr>
-      <w:r>
-        <w:t xml:space="preserve">Reusable Artifacts Created</w:t>
-      </w:r>
-    </w:p>
-    <w:p>
-      <w:pPr>
-        <w:pStyle w:val="FirstParagraph"/>
-      </w:pPr>
-      <w:r>
-        <w:t xml:space="preserve">All materials developed under this objective are immediately reusable by any instructor in the department:</w:t>
       </w:r>
     </w:p>
     <w:p>
@@ -1709,15 +1709,16 @@
       </w:pPr>
       <w:r>
         <w:rPr>
-          <w:rStyle w:val="VerbatimChar"/>
-        </w:rPr>
-        <w:t xml:space="preserve">WORKFLOW_GUIDE.md</w:t>
-      </w:r>
-      <w:r>
-        <w:t xml:space="preserve"> </w:t>
-      </w:r>
-      <w:r>
-        <w:t xml:space="preserve">— Complete Sacred Workflow documentation</w:t>
+          <w:bCs/>
+          <w:b/>
+        </w:rPr>
+        <w:t xml:space="preserve">CSC 289</w:t>
+      </w:r>
+      <w:r>
+        <w:t xml:space="preserve"> </w:t>
+      </w:r>
+      <w:r>
+        <w:t xml:space="preserve">(Capstone): Full four-module implementation, current semester</w:t>
       </w:r>
     </w:p>
     <w:p>
@@ -1730,15 +1731,16 @@
       </w:pPr>
       <w:r>
         <w:rPr>
-          <w:rStyle w:val="VerbatimChar"/>
-        </w:rPr>
-        <w:t xml:space="preserve">ISSUE_TEMPLATE.md</w:t>
-      </w:r>
-      <w:r>
-        <w:t xml:space="preserve"> </w:t>
-      </w:r>
-      <w:r>
-        <w:t xml:space="preserve">— Issue creation template and guidelines</w:t>
+          <w:bCs/>
+          <w:b/>
+        </w:rPr>
+        <w:t xml:space="preserve">CTS 285</w:t>
+      </w:r>
+      <w:r>
+        <w:t xml:space="preserve"> </w:t>
+      </w:r>
+      <w:r>
+        <w:t xml:space="preserve">(Web Development): Issue tracking and basic branch workflow, current semester</w:t>
       </w:r>
     </w:p>
     <w:p>
@@ -1751,22 +1753,49 @@
       </w:pPr>
       <w:r>
         <w:rPr>
-          <w:rStyle w:val="VerbatimChar"/>
-        </w:rPr>
-        <w:t xml:space="preserve">Capstone_GameFAQs_Walkthrough.md</w:t>
-      </w:r>
-      <w:r>
-        <w:t xml:space="preserve"> </w:t>
-      </w:r>
-      <w:r>
-        <w:t xml:space="preserve">— Student-facing workflow guide</w:t>
+          <w:bCs/>
+          <w:b/>
+        </w:rPr>
+        <w:t xml:space="preserve">CSC 151</w:t>
+      </w:r>
+      <w:r>
+        <w:t xml:space="preserve"> </w:t>
+      </w:r>
+      <w:r>
+        <w:t xml:space="preserve">(Intro CS): Issue tracking module, planned implementation</w:t>
+      </w:r>
+    </w:p>
+    <w:p>
+      <w:pPr>
+        <w:pStyle w:val="FirstParagraph"/>
+      </w:pPr>
+      <w:r>
+        <w:t xml:space="preserve">Each time a student encounters this workflow in a subsequent course, the professional habit is reinforced rather than introduced. By the time they reach the capstone, students who have passed through lower-division courses with this framework arrive already fluent — compressing onboarding and enabling more sophisticated sprint work.</w:t>
+      </w:r>
+    </w:p>
+    <w:bookmarkEnd w:id="37"/>
+    <w:bookmarkStart w:id="38" w:name="reusable-artifacts-created"/>
+    <w:p>
+      <w:pPr>
+        <w:pStyle w:val="Heading3"/>
+      </w:pPr>
+      <w:r>
+        <w:t xml:space="preserve">Reusable Artifacts Created</w:t>
+      </w:r>
+    </w:p>
+    <w:p>
+      <w:pPr>
+        <w:pStyle w:val="FirstParagraph"/>
+      </w:pPr>
+      <w:r>
+        <w:t xml:space="preserve">All materials developed under this objective are immediately reusable by any instructor in the department:</w:t>
       </w:r>
     </w:p>
     <w:p>
       <w:pPr>
         <w:numPr>
           <w:ilvl w:val="0"/>
-          <w:numId w:val="1004"/>
+          <w:numId w:val="1005"/>
         </w:numPr>
         <w:pStyle w:val="Compact"/>
       </w:pPr>
@@ -1774,20 +1803,20 @@
         <w:rPr>
           <w:rStyle w:val="VerbatimChar"/>
         </w:rPr>
-        <w:t xml:space="preserve">YELLOW_Exit_Ticket_Rubric.md</w:t>
-      </w:r>
-      <w:r>
-        <w:t xml:space="preserve"> </w:t>
-      </w:r>
-      <w:r>
-        <w:t xml:space="preserve">— Competency assessment rubric</w:t>
+        <w:t xml:space="preserve">WORKFLOW_GUIDE.md</w:t>
+      </w:r>
+      <w:r>
+        <w:t xml:space="preserve"> </w:t>
+      </w:r>
+      <w:r>
+        <w:t xml:space="preserve">— Complete Sacred Workflow documentation</w:t>
       </w:r>
     </w:p>
     <w:p>
       <w:pPr>
         <w:numPr>
           <w:ilvl w:val="0"/>
-          <w:numId w:val="1004"/>
+          <w:numId w:val="1005"/>
         </w:numPr>
         <w:pStyle w:val="Compact"/>
       </w:pPr>
@@ -1795,20 +1824,83 @@
         <w:rPr>
           <w:rStyle w:val="VerbatimChar"/>
         </w:rPr>
-        <w:t xml:space="preserve">DAY_1_ESSENTIALS.md</w:t>
-      </w:r>
-      <w:r>
-        <w:t xml:space="preserve"> </w:t>
-      </w:r>
-      <w:r>
-        <w:t xml:space="preserve">— Day 1 orientation and setup guide</w:t>
+        <w:t xml:space="preserve">ISSUE_TEMPLATE.md</w:t>
+      </w:r>
+      <w:r>
+        <w:t xml:space="preserve"> </w:t>
+      </w:r>
+      <w:r>
+        <w:t xml:space="preserve">— Issue creation template and guidelines</w:t>
       </w:r>
     </w:p>
     <w:p>
       <w:pPr>
         <w:numPr>
           <w:ilvl w:val="0"/>
-          <w:numId w:val="1004"/>
+          <w:numId w:val="1005"/>
+        </w:numPr>
+        <w:pStyle w:val="Compact"/>
+      </w:pPr>
+      <w:r>
+        <w:rPr>
+          <w:rStyle w:val="VerbatimChar"/>
+        </w:rPr>
+        <w:t xml:space="preserve">Capstone_GameFAQs_Walkthrough.md</w:t>
+      </w:r>
+      <w:r>
+        <w:t xml:space="preserve"> </w:t>
+      </w:r>
+      <w:r>
+        <w:t xml:space="preserve">— Student-facing workflow guide</w:t>
+      </w:r>
+    </w:p>
+    <w:p>
+      <w:pPr>
+        <w:numPr>
+          <w:ilvl w:val="0"/>
+          <w:numId w:val="1005"/>
+        </w:numPr>
+        <w:pStyle w:val="Compact"/>
+      </w:pPr>
+      <w:r>
+        <w:rPr>
+          <w:rStyle w:val="VerbatimChar"/>
+        </w:rPr>
+        <w:t xml:space="preserve">YELLOW_Exit_Ticket_Rubric.md</w:t>
+      </w:r>
+      <w:r>
+        <w:t xml:space="preserve"> </w:t>
+      </w:r>
+      <w:r>
+        <w:t xml:space="preserve">— Competency assessment rubric</w:t>
+      </w:r>
+    </w:p>
+    <w:p>
+      <w:pPr>
+        <w:numPr>
+          <w:ilvl w:val="0"/>
+          <w:numId w:val="1005"/>
+        </w:numPr>
+        <w:pStyle w:val="Compact"/>
+      </w:pPr>
+      <w:r>
+        <w:rPr>
+          <w:rStyle w:val="VerbatimChar"/>
+        </w:rPr>
+        <w:t xml:space="preserve">DAY_1_ESSENTIALS.md</w:t>
+      </w:r>
+      <w:r>
+        <w:t xml:space="preserve"> </w:t>
+      </w:r>
+      <w:r>
+        <w:t xml:space="preserve">— Day 1 orientation and setup guide</w:t>
+      </w:r>
+    </w:p>
+    <w:p>
+      <w:pPr>
+        <w:numPr>
+          <w:ilvl w:val="0"/>
+          <w:numId w:val="1005"/>
         </w:numPr>
         <w:pStyle w:val="Compact"/>
       </w:pPr>
@@ -1831,9 +1923,9 @@
         </w:pict>
       </w:r>
     </w:p>
-    <w:bookmarkEnd w:id="37"/>
     <w:bookmarkEnd w:id="38"/>
-    <w:bookmarkStart w:id="39" w:name="Xcca662ef8e09cd0dbcbbc528043b9c695c79221"/>
+    <w:bookmarkEnd w:id="39"/>
+    <w:bookmarkStart w:id="40" w:name="Xcca662ef8e09cd0dbcbbc528043b9c695c79221"/>
     <w:p>
       <w:pPr>
         <w:pStyle w:val="Heading2"/>
@@ -1906,8 +1998,8 @@
         </w:pict>
       </w:r>
     </w:p>
-    <w:bookmarkEnd w:id="39"/>
-    <w:bookmarkStart w:id="40" w:name="summary"/>
+    <w:bookmarkEnd w:id="40"/>
+    <w:bookmarkStart w:id="41" w:name="summary"/>
     <w:p>
       <w:pPr>
         <w:pStyle w:val="Heading2"/>
@@ -2072,8 +2164,8 @@
         </w:pict>
       </w:r>
     </w:p>
-    <w:bookmarkEnd w:id="40"/>
-    <w:bookmarkStart w:id="41" w:name="references"/>
+    <w:bookmarkEnd w:id="41"/>
+    <w:bookmarkStart w:id="42" w:name="references"/>
     <w:p>
       <w:pPr>
         <w:pStyle w:val="Heading2"/>
@@ -2086,7 +2178,7 @@
       <w:pPr>
         <w:numPr>
           <w:ilvl w:val="0"/>
-          <w:numId w:val="1005"/>
+          <w:numId w:val="1006"/>
         </w:numPr>
         <w:pStyle w:val="Compact"/>
       </w:pPr>
@@ -2111,7 +2203,7 @@
       <w:pPr>
         <w:numPr>
           <w:ilvl w:val="0"/>
-          <w:numId w:val="1005"/>
+          <w:numId w:val="1006"/>
         </w:numPr>
         <w:pStyle w:val="Compact"/>
       </w:pPr>
@@ -2139,7 +2231,7 @@
       <w:pPr>
         <w:numPr>
           <w:ilvl w:val="0"/>
-          <w:numId w:val="1005"/>
+          <w:numId w:val="1006"/>
         </w:numPr>
         <w:pStyle w:val="Compact"/>
       </w:pPr>
@@ -2167,7 +2259,7 @@
       <w:pPr>
         <w:numPr>
           <w:ilvl w:val="0"/>
-          <w:numId w:val="1005"/>
+          <w:numId w:val="1006"/>
         </w:numPr>
         <w:pStyle w:val="Compact"/>
       </w:pPr>
@@ -2195,7 +2287,7 @@
       <w:pPr>
         <w:numPr>
           <w:ilvl w:val="0"/>
-          <w:numId w:val="1005"/>
+          <w:numId w:val="1006"/>
         </w:numPr>
         <w:pStyle w:val="Compact"/>
       </w:pPr>
@@ -2220,7 +2312,7 @@
       <w:pPr>
         <w:numPr>
           <w:ilvl w:val="0"/>
-          <w:numId w:val="1005"/>
+          <w:numId w:val="1006"/>
         </w:numPr>
         <w:pStyle w:val="Compact"/>
       </w:pPr>
@@ -2248,7 +2340,7 @@
       <w:pPr>
         <w:numPr>
           <w:ilvl w:val="0"/>
-          <w:numId w:val="1005"/>
+          <w:numId w:val="1006"/>
         </w:numPr>
         <w:pStyle w:val="Compact"/>
       </w:pPr>
@@ -2273,7 +2365,7 @@
       <w:pPr>
         <w:numPr>
           <w:ilvl w:val="0"/>
-          <w:numId w:val="1005"/>
+          <w:numId w:val="1006"/>
         </w:numPr>
         <w:pStyle w:val="Compact"/>
       </w:pPr>
@@ -2298,7 +2390,7 @@
       <w:pPr>
         <w:numPr>
           <w:ilvl w:val="0"/>
-          <w:numId w:val="1005"/>
+          <w:numId w:val="1006"/>
         </w:numPr>
         <w:pStyle w:val="Compact"/>
       </w:pPr>
@@ -2326,7 +2418,7 @@
       <w:pPr>
         <w:numPr>
           <w:ilvl w:val="0"/>
-          <w:numId w:val="1005"/>
+          <w:numId w:val="1006"/>
         </w:numPr>
         <w:pStyle w:val="Compact"/>
       </w:pPr>
@@ -2351,7 +2443,7 @@
       <w:pPr>
         <w:numPr>
           <w:ilvl w:val="0"/>
-          <w:numId w:val="1005"/>
+          <w:numId w:val="1006"/>
         </w:numPr>
         <w:pStyle w:val="Compact"/>
       </w:pPr>
@@ -2372,8 +2464,8 @@
         <w:t xml:space="preserve">(8), 90–95. https://doi.org/10.1145/1145287.1145293</w:t>
       </w:r>
     </w:p>
-    <w:bookmarkEnd w:id="41"/>
     <w:bookmarkEnd w:id="42"/>
+    <w:bookmarkEnd w:id="43"/>
     <w:sectPr>
       <w:footnotePr>
         <w:numRestart w:val="eachSect"/>
@@ -2688,6 +2780,9 @@
     <w:abstractNumId w:val="991"/>
   </w:num>
   <w:num w:numId="1005">
+    <w:abstractNumId w:val="991"/>
+  </w:num>
+  <w:num w:numId="1006">
     <w:abstractNumId w:val="99411"/>
     <w:lvlOverride w:ilvl="0">
       <w:startOverride w:val="1"/>

</xml_diff>

<commit_message>
Resolve merge conflicts: rebase GitHub Projects Kanban spike onto main
</commit_message>
<xml_diff>
--- a/outputs/04_Objective_2_Source_Control_Version_Control_Instructional_Modules.docx
+++ b/outputs/04_Objective_2_Source_Control_Version_Control_Instructional_Modules.docx
@@ -2,7 +2,7 @@
 <file path=word/document.xml><?xml version="1.0" encoding="utf-8"?>
 <w:document xmlns:w="http://schemas.openxmlformats.org/wordprocessingml/2006/main" xmlns:m="http://schemas.openxmlformats.org/officeDocument/2006/math" xmlns:r="http://schemas.openxmlformats.org/officeDocument/2006/relationships" xmlns:o="urn:schemas-microsoft-com:office:office" xmlns:v="urn:schemas-microsoft-com:vml" xmlns:w10="urn:schemas-microsoft-com:office:word" xmlns:a="http://schemas.openxmlformats.org/drawingml/2006/main" xmlns:pic="http://schemas.openxmlformats.org/drawingml/2006/picture" xmlns:wp="http://schemas.openxmlformats.org/drawingml/2006/wordprocessingDrawing">
   <w:body>
-    <w:bookmarkStart w:id="43" w:name="Xb6033da6e6e6ab42af6aa23972fd6adf8c7bac7"/>
+    <w:bookmarkStart w:id="41" w:name="Xb6033da6e6e6ab42af6aa23972fd6adf8c7bac7"/>
     <w:p>
       <w:pPr>
         <w:pStyle w:val="Heading1"/>
@@ -96,6 +96,45 @@
     <w:p>
       <w:pPr>
         <w:pStyle w:val="FirstParagraph"/>
+      </w:pPr>
+      <w:r>
+        <w:rPr>
+          <w:bCs/>
+          <w:b/>
+        </w:rPr>
+        <w:t xml:space="preserve">Original objective (verbatim):</w:t>
+      </w:r>
+      <w:r>
+        <w:t xml:space="preserve"> </w:t>
+      </w:r>
+      <w:r>
+        <w:t xml:space="preserve">“</w:t>
+      </w:r>
+      <w:r>
+        <w:t xml:space="preserve">Four assignments covering the topic</w:t>
+      </w:r>
+      <w:r>
+        <w:t xml:space="preserve"> </w:t>
+      </w:r>
+      <w:r>
+        <w:t xml:space="preserve">‘</w:t>
+      </w:r>
+      <w:r>
+        <w:t xml:space="preserve">GitHub collaboration and version control with your team</w:t>
+      </w:r>
+      <w:r>
+        <w:t xml:space="preserve">’</w:t>
+      </w:r>
+      <w:r>
+        <w:t xml:space="preserve">. (The assignments were delivered, but were disguised as portions of a game.)</w:t>
+      </w:r>
+      <w:r>
+        <w:t xml:space="preserve">”</w:t>
+      </w:r>
+    </w:p>
+    <w:p>
+      <w:pPr>
+        <w:pStyle w:val="BodyText"/>
       </w:pPr>
       <w:r>
         <w:rPr>
@@ -208,111 +247,22 @@
         <w:pStyle w:val="FirstParagraph"/>
       </w:pPr>
       <w:r>
-        <w:t xml:space="preserve">Anyone who has reviewed a junior developer’s onboarding experience knows that knowing Git commands and practicing Git workflow are not the same thing — and employers have become precise about that distinction.</w:t>
-      </w:r>
-    </w:p>
-    <w:p>
-      <w:pPr>
-        <w:pStyle w:val="BodyText"/>
-      </w:pPr>
-      <w:r>
-        <w:t xml:space="preserve">Garousi et al.’s 2020 systematic review in</w:t>
-      </w:r>
-      <w:r>
-        <w:t xml:space="preserve"> </w:t>
-      </w:r>
-      <w:r>
-        <w:rPr>
-          <w:iCs/>
-          <w:i/>
-        </w:rPr>
-        <w:t xml:space="preserve">IEEE Software</w:t>
-      </w:r>
-      <w:r>
-        <w:t xml:space="preserve">, synthesizing 33 empirical studies across 12 countries and more than 4,000 data points, identified</w:t>
-      </w:r>
-      <w:r>
-        <w:t xml:space="preserve"> </w:t>
-      </w:r>
-      <w:r>
-        <w:rPr>
-          <w:bCs/>
-          <w:b/>
-        </w:rPr>
+        <w:t xml:space="preserve">Anyone who has reviewed a junior developer’s onboarding experience knows that knowing Git commands and practicing Git workflow are not the same thing — and employers have become precise about that distinction. Version control workflow (</w:t>
+      </w:r>
+      <w:r>
+        <w:t xml:space="preserve">“</w:t>
+      </w:r>
+      <w:r>
         <w:t xml:space="preserve">configuration management</w:t>
       </w:r>
       <w:r>
-        <w:t xml:space="preserve"> </w:t>
-      </w:r>
-      <w:r>
-        <w:t xml:space="preserve">— the professional term for version control workflow — as one of the largest documented gaps between what CS graduates know and what employers actually need.</w:t>
-      </w:r>
-      <w:r>
-        <w:t xml:space="preserve">[1]</w:t>
-      </w:r>
-      <w:r>
-        <w:t xml:space="preserve"> </w:t>
-      </w:r>
-      <w:r>
-        <w:t xml:space="preserve">This is not an anecdotal concern. It is the consensus finding of a decade of software engineering education research.</w:t>
-      </w:r>
-    </w:p>
-    <w:p>
-      <w:pPr>
-        <w:pStyle w:val="BodyText"/>
-      </w:pPr>
-      <w:r>
-        <w:t xml:space="preserve">The scale of the gap becomes vivid when viewed against industry-use data. The Stack Overflow Developer Survey 2024 (n = 65,437 professional developers across 185 countries) reports that</w:t>
-      </w:r>
-      <w:r>
-        <w:t xml:space="preserve"> </w:t>
-      </w:r>
-      <w:r>
-        <w:rPr>
-          <w:bCs/>
-          <w:b/>
-        </w:rPr>
-        <w:t xml:space="preserve">93% of professional developers use Git</w:t>
-      </w:r>
-      <w:r>
-        <w:t xml:space="preserve"> </w:t>
-      </w:r>
-      <w:r>
-        <w:t xml:space="preserve">as their primary version control system.</w:t>
-      </w:r>
-      <w:r>
-        <w:t xml:space="preserve">[2]</w:t>
-      </w:r>
-      <w:r>
-        <w:t xml:space="preserve"> </w:t>
-      </w:r>
-      <w:r>
-        <w:t xml:space="preserve">GitHub’s Octoverse 2025 report documents that developers merged</w:t>
-      </w:r>
-      <w:r>
-        <w:t xml:space="preserve"> </w:t>
-      </w:r>
-      <w:r>
-        <w:rPr>
-          <w:bCs/>
-          <w:b/>
-        </w:rPr>
-        <w:t xml:space="preserve">43.2 million pull requests per month</w:t>
-      </w:r>
-      <w:r>
-        <w:t xml:space="preserve"> </w:t>
-      </w:r>
-      <w:r>
-        <w:t xml:space="preserve">on average — a 23% year-over-year increase — across the platform’s 180 million active users.</w:t>
-      </w:r>
-      <w:r>
-        <w:t xml:space="preserve">[3]</w:t>
-      </w:r>
-      <w:r>
-        <w:t xml:space="preserve"> </w:t>
-      </w:r>
-      <w:r>
-        <w:t xml:space="preserve">The pull request is not one workflow among many. It is the dominant transaction unit of professional software development.</w:t>
+        <w:t xml:space="preserve">”</w:t>
+      </w:r>
+      <w:r>
+        <w:t xml:space="preserve">) is widely cited in the software-engineering-education literature as a persistent gap between what CS graduates arrive knowing and what employers expect, and industry surveys put Git and pull-request-based collaboration at the center of day-to-day professional practice.</w:t>
+      </w:r>
+      <w:r>
+        <w:t xml:space="preserve">[1][2][3]</w:t>
       </w:r>
     </w:p>
     <w:p>
@@ -458,93 +408,22 @@
         <w:t xml:space="preserve"> </w:t>
       </w:r>
       <w:r>
-        <w:t xml:space="preserve">— a ceremonial framing of the standard professional development process. This framing is a deliberate pedagogical choice, not an aesthetic one, and it is grounded in well-established learning theory.</w:t>
-      </w:r>
-    </w:p>
-    <w:p>
-      <w:pPr>
-        <w:pStyle w:val="BodyText"/>
-      </w:pPr>
-      <w:r>
-        <w:t xml:space="preserve">Lee Shulman’s foundational work on</w:t>
-      </w:r>
-      <w:r>
-        <w:t xml:space="preserve"> </w:t>
-      </w:r>
-      <w:r>
-        <w:rPr>
-          <w:bCs/>
-          <w:b/>
-        </w:rPr>
-        <w:t xml:space="preserve">signature pedagogies</w:t>
-      </w:r>
-      <w:r>
-        <w:t xml:space="preserve"> </w:t>
-      </w:r>
-      <w:r>
-        <w:t xml:space="preserve">in professional education argues that the most effective training for professional practice is not content delivery but the ritualized enactment of professional acts — what Shulman calls pedagogies that develop</w:t>
-      </w:r>
-      <w:r>
-        <w:t xml:space="preserve"> </w:t>
-      </w:r>
-      <w:r>
-        <w:t xml:space="preserve">“</w:t>
-      </w:r>
-      <w:r>
-        <w:t xml:space="preserve">habits of the mind, habits of the heart, and habits of the hand.</w:t>
-      </w:r>
-      <w:r>
-        <w:t xml:space="preserve">”</w:t>
-      </w:r>
-      <w:r>
-        <w:t xml:space="preserve">[5]</w:t>
-      </w:r>
-      <w:r>
-        <w:t xml:space="preserve"> </w:t>
-      </w:r>
-      <w:r>
-        <w:t xml:space="preserve">The Sacred Workflow operationalizes this principle. By giving the workflow a name, a sequence, and a set of explicit commitments, students are not just learning a tool — they are being inducted into a community of practice.</w:t>
-      </w:r>
-    </w:p>
-    <w:p>
-      <w:pPr>
-        <w:pStyle w:val="BodyText"/>
-      </w:pPr>
-      <w:r>
-        <w:t xml:space="preserve">This is precisely the mechanism Lave and Wenger describe in</w:t>
-      </w:r>
-      <w:r>
-        <w:t xml:space="preserve"> </w:t>
-      </w:r>
-      <w:r>
-        <w:rPr>
-          <w:iCs/>
-          <w:i/>
-        </w:rPr>
-        <w:t xml:space="preserve">Situated Learning</w:t>
-      </w:r>
-      <w:r>
-        <w:t xml:space="preserve"> </w:t>
-      </w:r>
-      <w:r>
-        <w:t xml:space="preserve">(1991): newcomers become practitioners by performing the legitimate peripheral activities of the profession, not by studying those activities from a distance.</w:t>
-      </w:r>
-      <w:r>
-        <w:t xml:space="preserve">[6]</w:t>
-      </w:r>
-      <w:r>
-        <w:t xml:space="preserve"> </w:t>
-      </w:r>
-      <w:r>
-        <w:t xml:space="preserve">Opening a draft PR before code is complete, linking commits to issue numbers, and conducting a structured peer review before merging — these are not classroom simulations of professional practice. They are professional practice, at reduced scale and reduced stakes.</w:t>
-      </w:r>
-    </w:p>
-    <w:p>
-      <w:pPr>
-        <w:pStyle w:val="BodyText"/>
-      </w:pPr>
-      <w:r>
-        <w:t xml:space="preserve">When students encounter these same workflows in their first jobs — and given GitHub’s 180 million active users, they will — they will not be encountering them for the first time. They will be continuing a practice they already know.</w:t>
+        <w:t xml:space="preserve">— an in-character name for the standard</w:t>
+      </w:r>
+      <w:r>
+        <w:t xml:space="preserve"> </w:t>
+      </w:r>
+      <w:r>
+        <w:rPr>
+          <w:rStyle w:val="VerbatimChar"/>
+        </w:rPr>
+        <w:t xml:space="preserve">Issue → Branch → PR → Review → Merge</w:t>
+      </w:r>
+      <w:r>
+        <w:t xml:space="preserve"> </w:t>
+      </w:r>
+      <w:r>
+        <w:t xml:space="preserve">sequence that professional development teams use every day. Giving the workflow a name, a sequence, and a set of explicit commitments lets students rehearse the same moves they will encounter on the job — opening a draft PR before code is complete, linking commits to issue numbers, conducting a structured peer review before merging — at reduced scale and reduced stakes. When students hit these workflows in their first jobs, they will be continuing a practice they already know rather than encountering it for the first time.</w:t>
       </w:r>
     </w:p>
     <w:bookmarkEnd w:id="24"/>
@@ -1184,23 +1063,7 @@
         <w:pStyle w:val="FirstParagraph"/>
       </w:pPr>
       <w:r>
-        <w:t xml:space="preserve">This cycle — practiced at low stakes in Sprint 0, at moderate stakes in Sprint 1, and at full team complexity in Sprints 2 and 3 — builds the kind of</w:t>
-      </w:r>
-      <w:r>
-        <w:t xml:space="preserve"> </w:t>
-      </w:r>
-      <w:r>
-        <w:rPr>
-          <w:bCs/>
-          <w:b/>
-        </w:rPr>
-        <w:t xml:space="preserve">procedural automaticity</w:t>
-      </w:r>
-      <w:r>
-        <w:t xml:space="preserve"> </w:t>
-      </w:r>
-      <w:r>
-        <w:t xml:space="preserve">that Shulman identifies as the goal of signature-pedagogical formation: students stop</w:t>
+        <w:t xml:space="preserve">This cycle — practiced at low stakes in Sprint 0, at moderate stakes in Sprint 1, and at full team complexity in Sprints 2 and 3 — gives students enough repetitions that the workflow becomes routine: they stop</w:t>
       </w:r>
       <w:r>
         <w:t xml:space="preserve"> </w:t>
@@ -1216,7 +1079,7 @@
         <w:t xml:space="preserve"> </w:t>
       </w:r>
       <w:r>
-        <w:t xml:space="preserve">the workflow and start</w:t>
+        <w:t xml:space="preserve">the steps and start</w:t>
       </w:r>
       <w:r>
         <w:t xml:space="preserve"> </w:t>
@@ -1232,7 +1095,7 @@
         <w:t xml:space="preserve"> </w:t>
       </w:r>
       <w:r>
-        <w:t xml:space="preserve">it reflexively.</w:t>
+        <w:t xml:space="preserve">them reflexively.</w:t>
       </w:r>
     </w:p>
     <w:p>
@@ -1338,7 +1201,7 @@
               <w:jc w:val="left"/>
             </w:pPr>
             <w:r>
-              <w:t xml:space="preserve">100%</w:t>
+              <w:t xml:space="preserve">100% [SOURCE NEEDED: GH org export — issue-creation timestamps vs first-commit timestamps]</w:t>
             </w:r>
           </w:p>
         </w:tc>
@@ -1364,7 +1227,7 @@
               <w:jc w:val="left"/>
             </w:pPr>
             <w:r>
-              <w:t xml:space="preserve">92/100</w:t>
+              <w:t xml:space="preserve">92/100 [SOURCE NEEDED: graded rubric file]</w:t>
             </w:r>
           </w:p>
         </w:tc>
@@ -1390,7 +1253,7 @@
               <w:jc w:val="left"/>
             </w:pPr>
             <w:r>
-              <w:t xml:space="preserve">95%</w:t>
+              <w:t xml:space="preserve">95% [SOURCE NEEDED: GH org export of PR bodies]</w:t>
             </w:r>
           </w:p>
         </w:tc>
@@ -1416,7 +1279,7 @@
               <w:jc w:val="left"/>
             </w:pPr>
             <w:r>
-              <w:t xml:space="preserve">89%</w:t>
+              <w:t xml:space="preserve">89% [SOURCE NEEDED: instructor log / TA intake tickets]</w:t>
             </w:r>
           </w:p>
         </w:tc>
@@ -1442,7 +1305,7 @@
               <w:jc w:val="left"/>
             </w:pPr>
             <w:r>
-              <w:t xml:space="preserve">0 instances</w:t>
+              <w:t xml:space="preserve">0 instances [SOURCE NEEDED: instructor log — method of counting unclear]</w:t>
             </w:r>
           </w:p>
         </w:tc>
@@ -1468,7 +1331,7 @@
               <w:jc w:val="left"/>
             </w:pPr>
             <w:r>
-              <w:t xml:space="preserve">2.3 days</w:t>
+              <w:t xml:space="preserve">2.3 days [SOURCE NEEDED: GH org export or analytics tool — what tool generated this?]</w:t>
             </w:r>
           </w:p>
         </w:tc>
@@ -1494,7 +1357,7 @@
               <w:jc w:val="left"/>
             </w:pPr>
             <w:r>
-              <w:t xml:space="preserve">85/100</w:t>
+              <w:t xml:space="preserve">85/100 [SOURCE NEEDED: graded peer-review rubric file]</w:t>
             </w:r>
           </w:p>
         </w:tc>
@@ -1520,7 +1383,7 @@
               <w:jc w:val="left"/>
             </w:pPr>
             <w:r>
-              <w:t xml:space="preserve">94%</w:t>
+              <w:t xml:space="preserve">94% [SOURCE NEEDED: graded rubric / reviewer follow-up log]</w:t>
             </w:r>
           </w:p>
         </w:tc>
@@ -1546,7 +1409,7 @@
               <w:jc w:val="left"/>
             </w:pPr>
             <w:r>
-              <w:t xml:space="preserve">0</w:t>
+              <w:t xml:space="preserve">0 [SOURCE NEEDED: instructor log]</w:t>
             </w:r>
           </w:p>
         </w:tc>
@@ -1603,6 +1466,12 @@
         </w:rPr>
         <w:t xml:space="preserve">”</w:t>
       </w:r>
+      <w:r>
+        <w:t xml:space="preserve"> </w:t>
+      </w:r>
+      <w:r>
+        <w:t xml:space="preserve">[SOURCE NEEDED: survey/retro/exit-ticket]</w:t>
+      </w:r>
     </w:p>
     <w:p>
       <w:pPr>
@@ -1629,6 +1498,12 @@
         </w:rPr>
         <w:t xml:space="preserve">”</w:t>
       </w:r>
+      <w:r>
+        <w:t xml:space="preserve"> </w:t>
+      </w:r>
+      <w:r>
+        <w:t xml:space="preserve">[SOURCE NEEDED: survey/retro/exit-ticket]</w:t>
+      </w:r>
     </w:p>
     <w:p>
       <w:pPr>
@@ -1655,13 +1530,19 @@
         </w:rPr>
         <w:t xml:space="preserve">”</w:t>
       </w:r>
+      <w:r>
+        <w:t xml:space="preserve"> </w:t>
+      </w:r>
+      <w:r>
+        <w:t xml:space="preserve">[SOURCE NEEDED: survey/retro/exit-ticket]</w:t>
+      </w:r>
     </w:p>
     <w:p>
       <w:pPr>
         <w:pStyle w:val="FirstParagraph"/>
       </w:pPr>
       <w:r>
-        <w:t xml:space="preserve">Exit interview data indicates students could describe the PR-based workflow fluently, recognized it from internship and early job experiences, and reported confidence discussing version control discipline in job interviews — a concrete, measurable return on the instructional investment.</w:t>
+        <w:t xml:space="preserve">Exit interview data indicates students could describe the PR-based workflow fluently, recognized it from internship and early job experiences, and reported confidence discussing version control discipline in job interviews — a concrete, measurable return on the instructional investment. [SOURCE NEEDED: exit interview instrument + responses]</w:t>
       </w:r>
     </w:p>
     <w:p>
@@ -1673,22 +1554,13 @@
     </w:p>
     <w:bookmarkEnd w:id="35"/>
     <w:bookmarkEnd w:id="36"/>
-    <w:bookmarkStart w:id="39" w:name="scalability-and-institutional-value"/>
+    <w:bookmarkStart w:id="37" w:name="materials-available-on-request"/>
     <w:p>
       <w:pPr>
         <w:pStyle w:val="Heading2"/>
       </w:pPr>
       <w:r>
-        <w:t xml:space="preserve">Scalability and Institutional Value</w:t>
-      </w:r>
-    </w:p>
-    <w:bookmarkStart w:id="37" w:name="cross-course-implementation"/>
-    <w:p>
-      <w:pPr>
-        <w:pStyle w:val="Heading3"/>
-      </w:pPr>
-      <w:r>
-        <w:t xml:space="preserve">Cross-Course Implementation</w:t>
+        <w:t xml:space="preserve">Materials available on request</w:t>
       </w:r>
     </w:p>
     <w:p>
@@ -1696,7 +1568,7 @@
         <w:pStyle w:val="FirstParagraph"/>
       </w:pPr>
       <w:r>
-        <w:t xml:space="preserve">The modular design of the Sacred Workflow framework enables staged adoption across the curriculum:</w:t>
+        <w:t xml:space="preserve">The same workflow currently runs in CSC 289 (full four-module implementation) and in CTS 285 (issue tracking and basic branch workflow). If any other faculty member wants to try it — in CSC 151 or elsewhere — the supporting materials are available:</w:t>
       </w:r>
     </w:p>
     <w:p>
@@ -1709,16 +1581,15 @@
       </w:pPr>
       <w:r>
         <w:rPr>
-          <w:bCs/>
-          <w:b/>
-        </w:rPr>
-        <w:t xml:space="preserve">CSC 289</w:t>
-      </w:r>
-      <w:r>
-        <w:t xml:space="preserve"> </w:t>
-      </w:r>
-      <w:r>
-        <w:t xml:space="preserve">(Capstone): Full four-module implementation, current semester</w:t>
+          <w:rStyle w:val="VerbatimChar"/>
+        </w:rPr>
+        <w:t xml:space="preserve">WORKFLOW_GUIDE.md</w:t>
+      </w:r>
+      <w:r>
+        <w:t xml:space="preserve"> </w:t>
+      </w:r>
+      <w:r>
+        <w:t xml:space="preserve">— Complete Sacred Workflow documentation</w:t>
       </w:r>
     </w:p>
     <w:p>
@@ -1731,16 +1602,15 @@
       </w:pPr>
       <w:r>
         <w:rPr>
-          <w:bCs/>
-          <w:b/>
-        </w:rPr>
-        <w:t xml:space="preserve">CTS 285</w:t>
-      </w:r>
-      <w:r>
-        <w:t xml:space="preserve"> </w:t>
-      </w:r>
-      <w:r>
-        <w:t xml:space="preserve">(Web Development): Issue tracking and basic branch workflow, current semester</w:t>
+          <w:rStyle w:val="VerbatimChar"/>
+        </w:rPr>
+        <w:t xml:space="preserve">ISSUE_TEMPLATE.md</w:t>
+      </w:r>
+      <w:r>
+        <w:t xml:space="preserve"> </w:t>
+      </w:r>
+      <w:r>
+        <w:t xml:space="preserve">— Issue creation template and guidelines</w:t>
       </w:r>
     </w:p>
     <w:p>
@@ -1753,49 +1623,22 @@
       </w:pPr>
       <w:r>
         <w:rPr>
-          <w:bCs/>
-          <w:b/>
-        </w:rPr>
-        <w:t xml:space="preserve">CSC 151</w:t>
-      </w:r>
-      <w:r>
-        <w:t xml:space="preserve"> </w:t>
-      </w:r>
-      <w:r>
-        <w:t xml:space="preserve">(Intro CS): Issue tracking module, planned implementation</w:t>
-      </w:r>
-    </w:p>
-    <w:p>
-      <w:pPr>
-        <w:pStyle w:val="FirstParagraph"/>
-      </w:pPr>
-      <w:r>
-        <w:t xml:space="preserve">Each time a student encounters this workflow in a subsequent course, the professional habit is reinforced rather than introduced. By the time they reach the capstone, students who have passed through lower-division courses with this framework arrive already fluent — compressing onboarding and enabling more sophisticated sprint work.</w:t>
-      </w:r>
-    </w:p>
-    <w:bookmarkEnd w:id="37"/>
-    <w:bookmarkStart w:id="38" w:name="reusable-artifacts-created"/>
-    <w:p>
-      <w:pPr>
-        <w:pStyle w:val="Heading3"/>
-      </w:pPr>
-      <w:r>
-        <w:t xml:space="preserve">Reusable Artifacts Created</w:t>
-      </w:r>
-    </w:p>
-    <w:p>
-      <w:pPr>
-        <w:pStyle w:val="FirstParagraph"/>
-      </w:pPr>
-      <w:r>
-        <w:t xml:space="preserve">All materials developed under this objective are immediately reusable by any instructor in the department:</w:t>
+          <w:rStyle w:val="VerbatimChar"/>
+        </w:rPr>
+        <w:t xml:space="preserve">Capstone_GameFAQs_Walkthrough.md</w:t>
+      </w:r>
+      <w:r>
+        <w:t xml:space="preserve"> </w:t>
+      </w:r>
+      <w:r>
+        <w:t xml:space="preserve">— Student-facing workflow guide</w:t>
       </w:r>
     </w:p>
     <w:p>
       <w:pPr>
         <w:numPr>
           <w:ilvl w:val="0"/>
-          <w:numId w:val="1005"/>
+          <w:numId w:val="1004"/>
         </w:numPr>
         <w:pStyle w:val="Compact"/>
       </w:pPr>
@@ -1803,20 +1646,20 @@
         <w:rPr>
           <w:rStyle w:val="VerbatimChar"/>
         </w:rPr>
-        <w:t xml:space="preserve">WORKFLOW_GUIDE.md</w:t>
-      </w:r>
-      <w:r>
-        <w:t xml:space="preserve"> </w:t>
-      </w:r>
-      <w:r>
-        <w:t xml:space="preserve">— Complete Sacred Workflow documentation</w:t>
+        <w:t xml:space="preserve">YELLOW_Exit_Ticket_Rubric.md</w:t>
+      </w:r>
+      <w:r>
+        <w:t xml:space="preserve"> </w:t>
+      </w:r>
+      <w:r>
+        <w:t xml:space="preserve">— Competency assessment rubric</w:t>
       </w:r>
     </w:p>
     <w:p>
       <w:pPr>
         <w:numPr>
           <w:ilvl w:val="0"/>
-          <w:numId w:val="1005"/>
+          <w:numId w:val="1004"/>
         </w:numPr>
         <w:pStyle w:val="Compact"/>
       </w:pPr>
@@ -1824,87 +1667,24 @@
         <w:rPr>
           <w:rStyle w:val="VerbatimChar"/>
         </w:rPr>
-        <w:t xml:space="preserve">ISSUE_TEMPLATE.md</w:t>
-      </w:r>
-      <w:r>
-        <w:t xml:space="preserve"> </w:t>
-      </w:r>
-      <w:r>
-        <w:t xml:space="preserve">— Issue creation template and guidelines</w:t>
+        <w:t xml:space="preserve">DAY_1_ESSENTIALS.md</w:t>
+      </w:r>
+      <w:r>
+        <w:t xml:space="preserve"> </w:t>
+      </w:r>
+      <w:r>
+        <w:t xml:space="preserve">— Day 1 orientation and setup guide</w:t>
       </w:r>
     </w:p>
     <w:p>
       <w:pPr>
         <w:numPr>
           <w:ilvl w:val="0"/>
-          <w:numId w:val="1005"/>
+          <w:numId w:val="1004"/>
         </w:numPr>
         <w:pStyle w:val="Compact"/>
       </w:pPr>
       <w:r>
-        <w:rPr>
-          <w:rStyle w:val="VerbatimChar"/>
-        </w:rPr>
-        <w:t xml:space="preserve">Capstone_GameFAQs_Walkthrough.md</w:t>
-      </w:r>
-      <w:r>
-        <w:t xml:space="preserve"> </w:t>
-      </w:r>
-      <w:r>
-        <w:t xml:space="preserve">— Student-facing workflow guide</w:t>
-      </w:r>
-    </w:p>
-    <w:p>
-      <w:pPr>
-        <w:numPr>
-          <w:ilvl w:val="0"/>
-          <w:numId w:val="1005"/>
-        </w:numPr>
-        <w:pStyle w:val="Compact"/>
-      </w:pPr>
-      <w:r>
-        <w:rPr>
-          <w:rStyle w:val="VerbatimChar"/>
-        </w:rPr>
-        <w:t xml:space="preserve">YELLOW_Exit_Ticket_Rubric.md</w:t>
-      </w:r>
-      <w:r>
-        <w:t xml:space="preserve"> </w:t>
-      </w:r>
-      <w:r>
-        <w:t xml:space="preserve">— Competency assessment rubric</w:t>
-      </w:r>
-    </w:p>
-    <w:p>
-      <w:pPr>
-        <w:numPr>
-          <w:ilvl w:val="0"/>
-          <w:numId w:val="1005"/>
-        </w:numPr>
-        <w:pStyle w:val="Compact"/>
-      </w:pPr>
-      <w:r>
-        <w:rPr>
-          <w:rStyle w:val="VerbatimChar"/>
-        </w:rPr>
-        <w:t xml:space="preserve">DAY_1_ESSENTIALS.md</w:t>
-      </w:r>
-      <w:r>
-        <w:t xml:space="preserve"> </w:t>
-      </w:r>
-      <w:r>
-        <w:t xml:space="preserve">— Day 1 orientation and setup guide</w:t>
-      </w:r>
-    </w:p>
-    <w:p>
-      <w:pPr>
-        <w:numPr>
-          <w:ilvl w:val="0"/>
-          <w:numId w:val="1005"/>
-        </w:numPr>
-        <w:pStyle w:val="Compact"/>
-      </w:pPr>
-      <w:r>
         <w:t xml:space="preserve">Sprint planning integration guide, peer review rubrics, and scaffolding progression documentation</w:t>
       </w:r>
     </w:p>
@@ -1913,7 +1693,7 @@
         <w:pStyle w:val="FirstParagraph"/>
       </w:pPr>
       <w:r>
-        <w:t xml:space="preserve">This is infrastructure, not coursework. Any instructor in the department can adopt these materials without developing them from scratch.</w:t>
+        <w:t xml:space="preserve">Happy to share GitHub links with anyone who asks.</w:t>
       </w:r>
     </w:p>
     <w:p>
@@ -1923,15 +1703,14 @@
         </w:pict>
       </w:r>
     </w:p>
-    <w:bookmarkEnd w:id="38"/>
-    <w:bookmarkEnd w:id="39"/>
-    <w:bookmarkStart w:id="40" w:name="Xcca662ef8e09cd0dbcbbc528043b9c695c79221"/>
+    <w:bookmarkEnd w:id="37"/>
+    <w:bookmarkStart w:id="38" w:name="assessment"/>
     <w:p>
       <w:pPr>
         <w:pStyle w:val="Heading2"/>
       </w:pPr>
       <w:r>
-        <w:t xml:space="preserve">Assessment: Why This Exceeds Minimum Expectations</w:t>
+        <w:t xml:space="preserve">Assessment</w:t>
       </w:r>
     </w:p>
     <w:p>
@@ -1939,7 +1718,7 @@
         <w:pStyle w:val="FirstParagraph"/>
       </w:pPr>
       <w:r>
-        <w:t xml:space="preserve">The stated minimum for this objective was to create four instructional modules on branch strategy, peer review, and issue tracking. That minimum has been met.</w:t>
+        <w:t xml:space="preserve">The original objective specified four assignments covering GitHub collaboration and version control with a team. Four assignments were delivered, in the form documented above. The objective is met.</w:t>
       </w:r>
     </w:p>
     <w:p>
@@ -1947,48 +1726,7 @@
         <w:pStyle w:val="BodyText"/>
       </w:pPr>
       <w:r>
-        <w:t xml:space="preserve">What distinguishes this outcome from minimum compliance is the nature of what was built. Minimum compliance produces four assignments. What was delivered is a</w:t>
-      </w:r>
-      <w:r>
-        <w:t xml:space="preserve"> </w:t>
-      </w:r>
-      <w:r>
-        <w:rPr>
-          <w:bCs/>
-          <w:b/>
-        </w:rPr>
-        <w:t xml:space="preserve">transferable pedagogical framework</w:t>
-      </w:r>
-      <w:r>
-        <w:t xml:space="preserve"> </w:t>
-      </w:r>
-      <w:r>
-        <w:t xml:space="preserve">grounded in peer-reviewed research, validated by quantifiable student outcomes, and positioned for adoption across the curriculum.</w:t>
-      </w:r>
-    </w:p>
-    <w:p>
-      <w:pPr>
-        <w:pStyle w:val="BodyText"/>
-      </w:pPr>
-      <w:r>
-        <w:t xml:space="preserve">Standard instruction in version control produces students who know Git commands. What this framework produces — as the outcome data confirms — is students who practice Git workflow discipline automatically, who understand the professional context for every step they take, and who can articulate that understanding to a hiring manager.</w:t>
-      </w:r>
-    </w:p>
-    <w:p>
-      <w:pPr>
-        <w:pStyle w:val="BodyText"/>
-      </w:pPr>
-      <w:r>
-        <w:t xml:space="preserve">The Garousi et al. meta-analysis establishes that configuration management is among the largest documented gaps between what CS programs produce and what employers require.</w:t>
-      </w:r>
-      <w:r>
-        <w:t xml:space="preserve">[1]</w:t>
-      </w:r>
-      <w:r>
-        <w:t xml:space="preserve"> </w:t>
-      </w:r>
-      <w:r>
-        <w:t xml:space="preserve">This objective directly, measurably, and scalably addresses that gap. That is not minimum performance. That is the work a department does when it takes industry alignment seriously.</w:t>
+        <w:t xml:space="preserve">The supporting materials (the named workflow, the scaffolded exercise progression, the four-category review rubric, the day-one orientation) are the form the four assignments took. They are checked in and available on request to any other faculty in the department who wants to reuse them.</w:t>
       </w:r>
     </w:p>
     <w:p>
@@ -1998,8 +1736,8 @@
         </w:pict>
       </w:r>
     </w:p>
-    <w:bookmarkEnd w:id="40"/>
-    <w:bookmarkStart w:id="41" w:name="summary"/>
+    <w:bookmarkEnd w:id="38"/>
+    <w:bookmarkStart w:id="39" w:name="summary"/>
     <w:p>
       <w:pPr>
         <w:pStyle w:val="Heading2"/>
@@ -2164,8 +1902,8 @@
         </w:pict>
       </w:r>
     </w:p>
-    <w:bookmarkEnd w:id="41"/>
-    <w:bookmarkStart w:id="42" w:name="references"/>
+    <w:bookmarkEnd w:id="39"/>
+    <w:bookmarkStart w:id="40" w:name="references"/>
     <w:p>
       <w:pPr>
         <w:pStyle w:val="Heading2"/>
@@ -2178,7 +1916,7 @@
       <w:pPr>
         <w:numPr>
           <w:ilvl w:val="0"/>
-          <w:numId w:val="1006"/>
+          <w:numId w:val="1005"/>
         </w:numPr>
         <w:pStyle w:val="Compact"/>
       </w:pPr>
@@ -2203,7 +1941,7 @@
       <w:pPr>
         <w:numPr>
           <w:ilvl w:val="0"/>
-          <w:numId w:val="1006"/>
+          <w:numId w:val="1005"/>
         </w:numPr>
         <w:pStyle w:val="Compact"/>
       </w:pPr>
@@ -2231,7 +1969,7 @@
       <w:pPr>
         <w:numPr>
           <w:ilvl w:val="0"/>
-          <w:numId w:val="1006"/>
+          <w:numId w:val="1005"/>
         </w:numPr>
         <w:pStyle w:val="Compact"/>
       </w:pPr>
@@ -2259,7 +1997,7 @@
       <w:pPr>
         <w:numPr>
           <w:ilvl w:val="0"/>
-          <w:numId w:val="1006"/>
+          <w:numId w:val="1005"/>
         </w:numPr>
         <w:pStyle w:val="Compact"/>
       </w:pPr>
@@ -2287,7 +2025,7 @@
       <w:pPr>
         <w:numPr>
           <w:ilvl w:val="0"/>
-          <w:numId w:val="1006"/>
+          <w:numId w:val="1005"/>
         </w:numPr>
         <w:pStyle w:val="Compact"/>
       </w:pPr>
@@ -2312,7 +2050,7 @@
       <w:pPr>
         <w:numPr>
           <w:ilvl w:val="0"/>
-          <w:numId w:val="1006"/>
+          <w:numId w:val="1005"/>
         </w:numPr>
         <w:pStyle w:val="Compact"/>
       </w:pPr>
@@ -2340,7 +2078,7 @@
       <w:pPr>
         <w:numPr>
           <w:ilvl w:val="0"/>
-          <w:numId w:val="1006"/>
+          <w:numId w:val="1005"/>
         </w:numPr>
         <w:pStyle w:val="Compact"/>
       </w:pPr>
@@ -2365,7 +2103,7 @@
       <w:pPr>
         <w:numPr>
           <w:ilvl w:val="0"/>
-          <w:numId w:val="1006"/>
+          <w:numId w:val="1005"/>
         </w:numPr>
         <w:pStyle w:val="Compact"/>
       </w:pPr>
@@ -2390,7 +2128,7 @@
       <w:pPr>
         <w:numPr>
           <w:ilvl w:val="0"/>
-          <w:numId w:val="1006"/>
+          <w:numId w:val="1005"/>
         </w:numPr>
         <w:pStyle w:val="Compact"/>
       </w:pPr>
@@ -2418,7 +2156,7 @@
       <w:pPr>
         <w:numPr>
           <w:ilvl w:val="0"/>
-          <w:numId w:val="1006"/>
+          <w:numId w:val="1005"/>
         </w:numPr>
         <w:pStyle w:val="Compact"/>
       </w:pPr>
@@ -2443,7 +2181,7 @@
       <w:pPr>
         <w:numPr>
           <w:ilvl w:val="0"/>
-          <w:numId w:val="1006"/>
+          <w:numId w:val="1005"/>
         </w:numPr>
         <w:pStyle w:val="Compact"/>
       </w:pPr>
@@ -2464,8 +2202,8 @@
         <w:t xml:space="preserve">(8), 90–95. https://doi.org/10.1145/1145287.1145293</w:t>
       </w:r>
     </w:p>
-    <w:bookmarkEnd w:id="42"/>
-    <w:bookmarkEnd w:id="43"/>
+    <w:bookmarkEnd w:id="40"/>
+    <w:bookmarkEnd w:id="41"/>
     <w:sectPr>
       <w:footnotePr>
         <w:numRestart w:val="eachSect"/>
@@ -2780,9 +2518,6 @@
     <w:abstractNumId w:val="991"/>
   </w:num>
   <w:num w:numId="1005">
-    <w:abstractNumId w:val="991"/>
-  </w:num>
-  <w:num w:numId="1006">
     <w:abstractNumId w:val="99411"/>
     <w:lvlOverride w:ilvl="0">
       <w:startOverride w:val="1"/>

</xml_diff>